<commit_message>
docs(huong-dan): document the stock form extra-day setting
Co-Authored-By: Claude Opus 5 <noreply@anthropic.com>
</commit_message>
<xml_diff>
--- a/docs/huong-dan/quan-tri-he-thong/Huong-dan-quan-tri-he-thong.docx
+++ b/docs/huong-dan/quan-tri-he-thong/Huong-dan-quan-tri-he-thong.docx
@@ -3007,6 +3007,69 @@
       </w:r>
       <w:r>
         <w:t xml:space="preserve">.</w:t>
+      </w:r>
+    </w:p>
+    <w:p>
+      <w:pPr>
+        <w:pStyle w:val="ListParagraph"/>
+        <w:numPr>
+          <w:ilvl w:val="0"/>
+          <w:numId w:val="3"/>
+        </w:numPr>
+        <w:spacing w:after="80"/>
+      </w:pPr>
+      <w:r>
+        <w:t xml:space="preserve">Riêng biểu </w:t>
+      </w:r>
+      <w:r>
+        <w:rPr>
+          <w:b/>
+          <w:bCs/>
+        </w:rPr>
+        <w:t xml:space="preserve">Tồn kho</w:t>
+      </w:r>
+      <w:r>
+        <w:t xml:space="preserve"> được nhập trễ hơn các mục khác </w:t>
+      </w:r>
+      <w:r>
+        <w:rPr>
+          <w:b/>
+          <w:bCs/>
+        </w:rPr>
+        <w:t xml:space="preserve">1 ngày</w:t>
+      </w:r>
+      <w:r>
+        <w:t xml:space="preserve"> — đặt ở ô </w:t>
+      </w:r>
+      <w:r>
+        <w:rPr>
+          <w:b/>
+          <w:bCs/>
+        </w:rPr>
+        <w:t xml:space="preserve">“Biểu Tồn kho được nhập trễ hơn các mục khác bao nhiêu ngày”</w:t>
+      </w:r>
+      <w:r>
+        <w:t xml:space="preserve">. Tồn cuối ngày phải kiểm kho xong mới có số, nên ví dụ đặt cửa sổ </w:t>
+      </w:r>
+      <w:r>
+        <w:rPr>
+          <w:b/>
+          <w:bCs/>
+        </w:rPr>
+        <w:t xml:space="preserve">0</w:t>
+      </w:r>
+      <w:r>
+        <w:t xml:space="preserve">: các mục khác phải nhập trong ngày, còn biểu Tồn kho vẫn nhập được hết ngày hôm sau. Đặt ô này </w:t>
+      </w:r>
+      <w:r>
+        <w:rPr>
+          <w:b/>
+          <w:bCs/>
+        </w:rPr>
+        <w:t xml:space="preserve">0</w:t>
+      </w:r>
+      <w:r>
+        <w:t xml:space="preserve"> = biểu Tồn kho giống mọi mục khác.</w:t>
       </w:r>
     </w:p>
     <w:p>

</xml_diff>

<commit_message>
docs(huong-dan): document the purchase form extra-day setting
Co-Authored-By: Claude Opus 5 <noreply@anthropic.com>
</commit_message>
<xml_diff>
--- a/docs/huong-dan/quan-tri-he-thong/Huong-dan-quan-tri-he-thong.docx
+++ b/docs/huong-dan/quan-tri-he-thong/Huong-dan-quan-tri-he-thong.docx
@@ -3019,7 +3019,17 @@
         <w:spacing w:after="80"/>
       </w:pPr>
       <w:r>
-        <w:t xml:space="preserve">Riêng biểu </w:t>
+        <w:t xml:space="preserve">Riêng hai biểu </w:t>
+      </w:r>
+      <w:r>
+        <w:rPr>
+          <w:b/>
+          <w:bCs/>
+        </w:rPr>
+        <w:t xml:space="preserve">Thu mua</w:t>
+      </w:r>
+      <w:r>
+        <w:t xml:space="preserve"> và </w:t>
       </w:r>
       <w:r>
         <w:rPr>
@@ -3039,7 +3049,17 @@
         <w:t xml:space="preserve">1 ngày</w:t>
       </w:r>
       <w:r>
-        <w:t xml:space="preserve"> — đặt ở ô </w:t>
+        <w:t xml:space="preserve"> — mỗi biểu một ô: </w:t>
+      </w:r>
+      <w:r>
+        <w:rPr>
+          <w:b/>
+          <w:bCs/>
+        </w:rPr>
+        <w:t xml:space="preserve">“Biểu Thu mua được nhập trễ hơn các mục khác bao nhiêu ngày”</w:t>
+      </w:r>
+      <w:r>
+        <w:t xml:space="preserve"> và </w:t>
       </w:r>
       <w:r>
         <w:rPr>
@@ -3049,7 +3069,7 @@
         <w:t xml:space="preserve">“Biểu Tồn kho được nhập trễ hơn các mục khác bao nhiêu ngày”</w:t>
       </w:r>
       <w:r>
-        <w:t xml:space="preserve">. Tồn cuối ngày phải kiểm kho xong mới có số, nên ví dụ đặt cửa sổ </w:t>
+        <w:t xml:space="preserve">. Ví dụ đặt cửa sổ </w:t>
       </w:r>
       <w:r>
         <w:rPr>
@@ -3059,7 +3079,7 @@
         <w:t xml:space="preserve">0</w:t>
       </w:r>
       <w:r>
-        <w:t xml:space="preserve">: các mục khác phải nhập trong ngày, còn biểu Tồn kho vẫn nhập được hết ngày hôm sau. Đặt ô này </w:t>
+        <w:t xml:space="preserve">: các mục khác phải nhập trong ngày, còn hai biểu này vẫn nhập được hết ngày hôm sau (đơn giá mủ trên biểu Thu mua đi cùng biểu). Đặt ô của biểu nào về </w:t>
       </w:r>
       <w:r>
         <w:rPr>
@@ -3069,7 +3089,7 @@
         <w:t xml:space="preserve">0</w:t>
       </w:r>
       <w:r>
-        <w:t xml:space="preserve"> = biểu Tồn kho giống mọi mục khác.</w:t>
+        <w:t xml:space="preserve"> = biểu đó giống mọi mục khác.</w:t>
       </w:r>
     </w:p>
     <w:p>

</xml_diff>